<commit_message>
Evolution API per account
</commit_message>
<xml_diff>
--- a/DEPLOY.docx
+++ b/DEPLOY.docx
@@ -55,7 +55,50 @@
           <w:b/>
           <w:bCs/>
         </w:rPr>
-        <w:t>Update the source code:</w:t>
+        <w:t>Update the source code</w:t>
+      </w:r>
+      <w:r>
+        <w:rPr>
+          <w:b/>
+          <w:bCs/>
+        </w:rPr>
+        <w:t xml:space="preserve"> through </w:t>
+      </w:r>
+      <w:proofErr w:type="spellStart"/>
+      <w:r>
+        <w:rPr>
+          <w:b/>
+          <w:bCs/>
+        </w:rPr>
+        <w:t>github</w:t>
+      </w:r>
+      <w:proofErr w:type="spellEnd"/>
+      <w:r>
+        <w:rPr>
+          <w:b/>
+          <w:bCs/>
+        </w:rPr>
+        <w:t xml:space="preserve"> </w:t>
+      </w:r>
+      <w:r>
+        <w:rPr>
+          <mc:AlternateContent>
+            <mc:Choice Requires="w16se"/>
+            <mc:Fallback>
+              <w:rFonts w:ascii="Segoe UI Emoji" w:eastAsia="Segoe UI Emoji" w:hAnsi="Segoe UI Emoji" w:cs="Segoe UI Emoji"/>
+            </mc:Fallback>
+          </mc:AlternateContent>
+          <w:b/>
+          <w:bCs/>
+        </w:rPr>
+        <mc:AlternateContent>
+          <mc:Choice Requires="w16se">
+            <w16se:symEx w16se:font="Segoe UI Emoji" w16se:char="1F609"/>
+          </mc:Choice>
+          <mc:Fallback>
+            <w:t>😉</w:t>
+          </mc:Fallback>
+        </mc:AlternateContent>
       </w:r>
     </w:p>
     <w:p>
@@ -1783,6 +1826,7 @@
   <w:style w:type="character" w:default="1" w:styleId="DefaultParagraphFont">
     <w:name w:val="Default Paragraph Font"/>
     <w:uiPriority w:val="1"/>
+    <w:semiHidden/>
     <w:unhideWhenUsed/>
   </w:style>
   <w:style w:type="table" w:default="1" w:styleId="TableNormal">

</xml_diff>